<commit_message>
Fix data quality, remove overclaiming, add naive baseline, honest limitations
- abs(weight) for 292 train / 145 val negative-weight records
- Document RPM outliers (0.78%) as possible corruptions; model sees actual targets
- Drop month/quarter/dayofyear/sin-cos-year (OOD for Nov-Dec validation)
- Add naive baseline (median rpm x distance) to OOT benchmark
- December predictions written to separate output; original input not overwritten
- Remove holiday surge claim (no evidence: day>=25 avg == rest of month)
- Describe actual weekly pattern: Mon ~, Wed ~
- Add honest Dec absolute-level uncertainty caveat
- Remove overclaiming: production-grade, impervious, state-of-the-art, perfectly aligned
- Add Limitations section to PDF, DOCX, README
- quote_signal correlation ~0.05 (noisy auxiliary, not reliable rate estimate)
- Corrected benchmark table metrics to match actual pipeline output
- LOOM script updated with accurate numbers and claims-to-avoid list
</commit_message>
<xml_diff>
--- a/Freight_Rate_ML_Assessment_Report.docx
+++ b/Freight_Rate_ML_Assessment_Report.docx
@@ -59,7 +59,7 @@
                 <w:color w:val="064A56"/>
                 <w:sz w:val="17"/>
               </w:rPr>
-              <w:t>Candidate Solution</w:t>
+              <w:t>Solution</w:t>
               <w:br/>
             </w:r>
             <w:r>
@@ -68,7 +68,7 @@
                 <w:color w:val="212529"/>
                 <w:sz w:val="19"/>
               </w:rPr>
-              <w:t>Production ML Pipeline</w:t>
+              <w:t>ML Pipeline (train_predict.py)</w:t>
             </w:r>
           </w:p>
         </w:tc>
@@ -162,7 +162,7 @@
           <w:color w:val="212529"/>
           <w:sz w:val="20"/>
         </w:rPr>
-        <w:t>This report outlines the end-to-end machine learning solution designed to predict freight load posted rates (`posted_rate`) across dynamic national trucking corridors. Using 48,000 historical freight loads spanning January 1 to October 31, 2025, we engineered a robust pricing model and applied it to 12,000 validation loads (November-December 2025) and a fixed 31-day December scenario. Our solution achieves state-of-the-art accuracy with an Out-of-Time MAE of $110.94, Median Absolute Error of $35.78, and an R² of 0.8270, validated with 0 errors via Spotter's official `score.py` harness.</w:t>
+        <w:t>This report outlines the machine learning solution developed to predict freight load posted rates (`posted_rate`) across national trucking corridors. Using 48,000 historical freight loads spanning January 1 to October 31, 2025, we built a geospatial-temporal pipeline, validated it on an Out-of-Time holdout, and applied it to 12,000 validation loads (November-December 2025) and a fixed 31-day December scenario. The OOT holdout yields a MAE of approximately $129, Median Absolute Error of $56, and R² of 0.82. Both output files pass Spotter's official `score.py` evaluation with zero errors.</w:t>
       </w:r>
     </w:p>
     <w:p>
@@ -266,7 +266,7 @@
           <w:color w:val="064A56"/>
           <w:sz w:val="28"/>
         </w:rPr>
-        <w:t>3. Data Exploration &amp; Quality Remediation</w:t>
+        <w:t>3. Data Exploration &amp; Quality Findings</w:t>
       </w:r>
     </w:p>
     <w:p>
@@ -279,7 +279,7 @@
           <w:color w:val="212529"/>
           <w:sz w:val="20"/>
         </w:rPr>
-        <w:t>During extensive exploratory data analysis (EDA), three key data-quality challenges were identified and systematically resolved:</w:t>
+        <w:t>Five data-quality issues were identified during EDA:</w:t>
       </w:r>
     </w:p>
     <w:p>
@@ -293,7 +293,7 @@
           <w:color w:val="212529"/>
           <w:sz w:val="20"/>
         </w:rPr>
-        <w:t xml:space="preserve">1. Missing Weight Values: </w:t>
+        <w:t xml:space="preserve">1. Negative Weights: </w:t>
       </w:r>
       <w:r>
         <w:rPr>
@@ -301,7 +301,7 @@
           <w:color w:val="212529"/>
           <w:sz w:val="20"/>
         </w:rPr>
-        <w:t>300 loads in training (0.63%) and 165 loads in validation (1.38%) lacked payload weight. Rather than row-deletion or naive overall mean filling, we analyzed weight distributions across equipment types. Dry Van and Flatbed payloads have distinct weight profiles. We imputed missing weights with domain-aligned median payloads (31,000 lbs) and generated an explicit boolean indicator (`weight_isna`) to allow tree algorithms to learn any potential reporting bias.</w:t>
+        <w:t>292 training records and 145 validation records carry a negative weight value. These are sign-flip recording errors; the correct value is the absolute value. The fix `abs(weight)` is applied before any imputation.</w:t>
       </w:r>
     </w:p>
     <w:p>
@@ -315,7 +315,7 @@
           <w:color w:val="212529"/>
           <w:sz w:val="20"/>
         </w:rPr>
-        <w:t xml:space="preserve">2. Missing Macro Market Index: </w:t>
+        <w:t xml:space="preserve">2. RPM Outliers (possible corruptions): </w:t>
       </w:r>
       <w:r>
         <w:rPr>
@@ -323,7 +323,7 @@
           <w:color w:val="212529"/>
           <w:sz w:val="20"/>
         </w:rPr>
-        <w:t>374 training loads (0.78%) and 249 validation loads (2.08%) lacked `market_index`. We discovered that `market_index` behaves as a daily macro-level indicator with tight intra-day clustering (std dev ~0.024). We constructed a daily market calendar lookup from observed days to impute missing days, defaulting to a neutral baseline of 1.0 alongside a `market_index_isna` flag.</w:t>
+        <w:t>0.78% of training records (373 rows: 270 with rpm &gt; 6.0, 103 with rpm &lt; 0.5) have implausible rate-per-mile values. The high-rpm subset may include genuine short-haul premiums; the low-rpm subset cannot be explained by any normal freight scenario and may be test or mis-keyed records. Both are flagged in code for future audit; the model sees their actual posted_rate targets.</w:t>
       </w:r>
     </w:p>
     <w:p>
@@ -337,7 +337,7 @@
           <w:color w:val="212529"/>
           <w:sz w:val="20"/>
         </w:rPr>
-        <w:t xml:space="preserve">3. Unseen Geographic Markets in Validation: </w:t>
+        <w:t xml:space="preserve">3. Missing Weight Values: </w:t>
       </w:r>
       <w:r>
         <w:rPr>
@@ -345,7 +345,51 @@
           <w:color w:val="212529"/>
           <w:sz w:val="20"/>
         </w:rPr>
-        <w:t>Validation data introduces 8 brand new pickup and delivery cities never seen in training: Laredo, Charlotte, Knoxville, Jackson, Norfolk, Chicago, Allentown, and San Diego. Models relying solely on categorical city IDs fail completely on unseen geographies. To solve this, our pipeline relies on precise spatial coordinates (`pickup_lat`, `pickup_lon`, `delivery_lat`, `delivery_lon`), Great-Circle Haversine distances, route tortuosity, and coordinate deltas, enabling 100% inductive zero-shot generalization across any newly introduced market.</w:t>
+        <w:t>300 training loads (0.63%) and 165 validation loads (1.38%) lacked payload weight. Missing values are imputed with a domain-aligned median (31,000 lbs) and an explicit boolean indicator `weight_isna` is added.</w:t>
+      </w:r>
+    </w:p>
+    <w:p>
+      <w:pPr>
+        <w:spacing w:before="40" w:after="80" w:line="276" w:lineRule="auto"/>
+      </w:pPr>
+      <w:r>
+        <w:rPr>
+          <w:rFonts w:ascii="Segoe UI" w:hAnsi="Segoe UI"/>
+          <w:b/>
+          <w:color w:val="212529"/>
+          <w:sz w:val="20"/>
+        </w:rPr>
+        <w:t xml:space="preserve">4. Missing Market Index: </w:t>
+      </w:r>
+      <w:r>
+        <w:rPr>
+          <w:rFonts w:ascii="Segoe UI" w:hAnsi="Segoe UI"/>
+          <w:color w:val="212529"/>
+          <w:sz w:val="20"/>
+        </w:rPr>
+        <w:t>374 training loads (0.78%) and 249 validation loads (2.08%) lacked `market_index`. Because market index is a daily indicator with tight intra-day variance (~0.024 std), missing days are filled via a daily calendar mean lookup. A `market_index_isna` flag is included.</w:t>
+      </w:r>
+    </w:p>
+    <w:p>
+      <w:pPr>
+        <w:spacing w:before="40" w:after="80" w:line="276" w:lineRule="auto"/>
+      </w:pPr>
+      <w:r>
+        <w:rPr>
+          <w:rFonts w:ascii="Segoe UI" w:hAnsi="Segoe UI"/>
+          <w:b/>
+          <w:color w:val="212529"/>
+          <w:sz w:val="20"/>
+        </w:rPr>
+        <w:t xml:space="preserve">5. Unseen Cities in Validation: </w:t>
+      </w:r>
+      <w:r>
+        <w:rPr>
+          <w:rFonts w:ascii="Segoe UI" w:hAnsi="Segoe UI"/>
+          <w:color w:val="212529"/>
+          <w:sz w:val="20"/>
+        </w:rPr>
+        <w:t>Validation data introduces 8 cities not present in training: Laredo, Charlotte, Knoxville, Jackson, Norfolk, Chicago, Allentown, and San Diego. Rather than using categorical city IDs, the model uses Haversine coordinates, tortuosity, and coordinate deltas, which generalise to any lat/lon pair.</w:t>
       </w:r>
     </w:p>
     <w:p>
@@ -360,29 +404,7 @@
           <w:color w:val="064A56"/>
           <w:sz w:val="28"/>
         </w:rPr>
-        <w:t>4. Feature Engineering Architecture</w:t>
-      </w:r>
-    </w:p>
-    <w:p>
-      <w:pPr>
-        <w:spacing w:before="40" w:after="80" w:line="276" w:lineRule="auto"/>
-      </w:pPr>
-      <w:r>
-        <w:rPr>
-          <w:rFonts w:ascii="Segoe UI" w:hAnsi="Segoe UI"/>
-          <w:b/>
-          <w:color w:val="212529"/>
-          <w:sz w:val="20"/>
-        </w:rPr>
-        <w:t xml:space="preserve">Multidimensional Signals: </w:t>
-      </w:r>
-      <w:r>
-        <w:rPr>
-          <w:rFonts w:ascii="Segoe UI" w:hAnsi="Segoe UI"/>
-          <w:color w:val="212529"/>
-          <w:sz w:val="20"/>
-        </w:rPr>
-        <w:t>Our pipeline creates 35 rich predictive features across four modular domains:</w:t>
+        <w:t>4. Feature Engineering</w:t>
       </w:r>
     </w:p>
     <w:p>
@@ -395,13 +417,26 @@
           <w:color w:val="212529"/>
           <w:sz w:val="20"/>
         </w:rPr>
-        <w:t>• Temporal Dynamics: Day of week, day of month, month, day of year, quarter, weekend indicator (`is_weekend`), month-end surge indicator (`day &gt;= 25`), and continuous cyclical sinusoidal transforms (`sin_dayofweek`, `cos_dayofweek`, `sin_dayofyear`, `cos_dayofyear`).</w:t>
+        <w:t>The pipeline creates 29 predictive features across four domains. Five date-level features were deliberately excluded: `month`, `quarter`, `dayofyear`, `sin_dayofyear`, `cos_dayofyear`. The model is trained on January-October only; those features take values in November-December that the model never saw, so any splits it learned on them would not generalise.</w:t>
+      </w:r>
+    </w:p>
+    <w:p>
+      <w:pPr>
+        <w:spacing w:before="40" w:after="80" w:line="276" w:lineRule="auto"/>
+      </w:pPr>
+      <w:r>
+        <w:rPr>
+          <w:rFonts w:ascii="Segoe UI" w:hAnsi="Segoe UI"/>
+          <w:color w:val="212529"/>
+          <w:sz w:val="20"/>
+        </w:rPr>
+        <w:t>• Temporal (within-week, always in range): `day`, `dayofweek`, `is_weekend`, `is_month_end`, `sin_dayofweek`, `cos_dayofweek`.</w:t>
         <w:br/>
-        <w:t>• Geospatial &amp; Routing: Haversine distance, route tortuosity ratio (`distance / haversine`), absolute latitude/longitude deltas, and corridor midpoint coordinates.</w:t>
+        <w:t>• Geospatial: `pickup_lat/lon`, `delivery_lat/lon`, Haversine, tortuosity, `lat_diff`, `lon_diff`, midpoint coordinates.</w:t>
         <w:br/>
-        <w:t>• Payload &amp; Equipment: One-hot encoded equipment categories (`Dry Van`, `Flatbed`, `Reefer`), weight payload tiers (light, medium, heavy), and ton-miles payload density.</w:t>
+        <w:t>• Payload &amp; Equipment: `weight_filled`, `weight_isna`, `weight_tier`, `ton_miles`, `distance`, one-hot equipment flags.</w:t>
         <w:br/>
-        <w:t>• Broker &amp; Market Baselines: Baseline expected quote (`distance * quote_signal`), market-adjusted baseline (`est_base * market_index`), and quote-by-market cross-interactions.</w:t>
+        <w:t>• Market / broker signals: `quote_signal` (corr with rpm ~0.05, treated as noisy auxiliary), `est_base`, `market_index_filled`, `market_index_isna`, `market_adj_base`, `quote_x_market`.</w:t>
       </w:r>
     </w:p>
     <w:p>
@@ -561,6 +596,283 @@
         <w:tc>
           <w:tcPr>
             <w:tcW w:type="dxa" w:w="2016"/>
+          </w:tcPr>
+          <w:p/>
+        </w:tc>
+        <w:tc>
+          <w:tcPr>
+            <w:tcW w:type="dxa" w:w="2016"/>
+          </w:tcPr>
+          <w:p/>
+        </w:tc>
+        <w:tc>
+          <w:tcPr>
+            <w:tcW w:type="dxa" w:w="2016"/>
+          </w:tcPr>
+          <w:p/>
+        </w:tc>
+        <w:tc>
+          <w:tcPr>
+            <w:tcW w:type="dxa" w:w="2016"/>
+          </w:tcPr>
+          <w:p/>
+        </w:tc>
+        <w:tc>
+          <w:tcPr>
+            <w:tcW w:type="dxa" w:w="2016"/>
+          </w:tcPr>
+          <w:p/>
+        </w:tc>
+      </w:tr>
+      <w:tr>
+        <w:tc>
+          <w:tcPr>
+            <w:tcW w:type="dxa" w:w="2016"/>
+          </w:tcPr>
+          <w:p/>
+        </w:tc>
+        <w:tc>
+          <w:tcPr>
+            <w:tcW w:type="dxa" w:w="2016"/>
+          </w:tcPr>
+          <w:p/>
+        </w:tc>
+        <w:tc>
+          <w:tcPr>
+            <w:tcW w:type="dxa" w:w="2016"/>
+          </w:tcPr>
+          <w:p/>
+        </w:tc>
+        <w:tc>
+          <w:tcPr>
+            <w:tcW w:type="dxa" w:w="2016"/>
+          </w:tcPr>
+          <w:p/>
+        </w:tc>
+        <w:tc>
+          <w:tcPr>
+            <w:tcW w:type="dxa" w:w="2016"/>
+          </w:tcPr>
+          <w:p/>
+        </w:tc>
+      </w:tr>
+      <w:tr>
+        <w:tc>
+          <w:tcPr>
+            <w:tcW w:type="dxa" w:w="2016"/>
+          </w:tcPr>
+          <w:p/>
+        </w:tc>
+        <w:tc>
+          <w:tcPr>
+            <w:tcW w:type="dxa" w:w="2016"/>
+          </w:tcPr>
+          <w:p/>
+        </w:tc>
+        <w:tc>
+          <w:tcPr>
+            <w:tcW w:type="dxa" w:w="2016"/>
+          </w:tcPr>
+          <w:p/>
+        </w:tc>
+        <w:tc>
+          <w:tcPr>
+            <w:tcW w:type="dxa" w:w="2016"/>
+          </w:tcPr>
+          <w:p/>
+        </w:tc>
+        <w:tc>
+          <w:tcPr>
+            <w:tcW w:type="dxa" w:w="2016"/>
+          </w:tcPr>
+          <w:p/>
+        </w:tc>
+      </w:tr>
+      <w:tr>
+        <w:tc>
+          <w:tcPr>
+            <w:tcW w:type="dxa" w:w="2016"/>
+          </w:tcPr>
+          <w:p/>
+        </w:tc>
+        <w:tc>
+          <w:tcPr>
+            <w:tcW w:type="dxa" w:w="2016"/>
+          </w:tcPr>
+          <w:p/>
+        </w:tc>
+        <w:tc>
+          <w:tcPr>
+            <w:tcW w:type="dxa" w:w="2016"/>
+          </w:tcPr>
+          <w:p/>
+        </w:tc>
+        <w:tc>
+          <w:tcPr>
+            <w:tcW w:type="dxa" w:w="2016"/>
+          </w:tcPr>
+          <w:p/>
+        </w:tc>
+        <w:tc>
+          <w:tcPr>
+            <w:tcW w:type="dxa" w:w="2016"/>
+          </w:tcPr>
+          <w:p/>
+        </w:tc>
+      </w:tr>
+      <w:tr>
+        <w:tc>
+          <w:tcPr>
+            <w:tcW w:type="dxa" w:w="2016"/>
+          </w:tcPr>
+          <w:p/>
+        </w:tc>
+        <w:tc>
+          <w:tcPr>
+            <w:tcW w:type="dxa" w:w="2016"/>
+          </w:tcPr>
+          <w:p/>
+        </w:tc>
+        <w:tc>
+          <w:tcPr>
+            <w:tcW w:type="dxa" w:w="2016"/>
+          </w:tcPr>
+          <w:p/>
+        </w:tc>
+        <w:tc>
+          <w:tcPr>
+            <w:tcW w:type="dxa" w:w="2016"/>
+          </w:tcPr>
+          <w:p/>
+        </w:tc>
+        <w:tc>
+          <w:tcPr>
+            <w:tcW w:type="dxa" w:w="2016"/>
+          </w:tcPr>
+          <w:p/>
+        </w:tc>
+      </w:tr>
+    </w:tbl>
+    <w:tbl>
+      <w:tblPr>
+        <w:tblW w:type="auto" w:w="0"/>
+        <w:jc w:val="center"/>
+        <w:tblLayout w:type="fixed"/>
+        <w:tblLook w:firstColumn="1" w:firstRow="1" w:lastColumn="0" w:lastRow="0" w:noHBand="0" w:noVBand="1" w:val="04A0"/>
+      </w:tblPr>
+      <w:tblGrid>
+        <w:gridCol w:w="2016"/>
+        <w:gridCol w:w="2016"/>
+        <w:gridCol w:w="2016"/>
+        <w:gridCol w:w="2016"/>
+        <w:gridCol w:w="2016"/>
+      </w:tblGrid>
+      <w:tr>
+        <w:tc>
+          <w:tcPr>
+            <w:tcW w:type="dxa" w:w="2016"/>
+            <w:shd w:fill="064A56"/>
+          </w:tcPr>
+          <w:p>
+            <w:pPr>
+              <w:jc w:val="center"/>
+            </w:pPr>
+            <w:r>
+              <w:rPr>
+                <w:rFonts w:ascii="Segoe UI" w:hAnsi="Segoe UI"/>
+                <w:b/>
+                <w:color w:val="FFFFFF"/>
+                <w:sz w:val="18"/>
+              </w:rPr>
+              <w:t>Model &amp; Formulation</w:t>
+            </w:r>
+          </w:p>
+        </w:tc>
+        <w:tc>
+          <w:tcPr>
+            <w:tcW w:type="dxa" w:w="2016"/>
+            <w:shd w:fill="064A56"/>
+          </w:tcPr>
+          <w:p>
+            <w:pPr>
+              <w:jc w:val="center"/>
+            </w:pPr>
+            <w:r>
+              <w:rPr>
+                <w:rFonts w:ascii="Segoe UI" w:hAnsi="Segoe UI"/>
+                <w:b/>
+                <w:color w:val="FFFFFF"/>
+                <w:sz w:val="18"/>
+              </w:rPr>
+              <w:t>Loss Objective</w:t>
+            </w:r>
+          </w:p>
+        </w:tc>
+        <w:tc>
+          <w:tcPr>
+            <w:tcW w:type="dxa" w:w="2016"/>
+            <w:shd w:fill="064A56"/>
+          </w:tcPr>
+          <w:p>
+            <w:pPr>
+              <w:jc w:val="center"/>
+            </w:pPr>
+            <w:r>
+              <w:rPr>
+                <w:rFonts w:ascii="Segoe UI" w:hAnsi="Segoe UI"/>
+                <w:b/>
+                <w:color w:val="FFFFFF"/>
+                <w:sz w:val="18"/>
+              </w:rPr>
+              <w:t>RMSE ($)</w:t>
+            </w:r>
+          </w:p>
+        </w:tc>
+        <w:tc>
+          <w:tcPr>
+            <w:tcW w:type="dxa" w:w="2016"/>
+            <w:shd w:fill="064A56"/>
+          </w:tcPr>
+          <w:p>
+            <w:pPr>
+              <w:jc w:val="center"/>
+            </w:pPr>
+            <w:r>
+              <w:rPr>
+                <w:rFonts w:ascii="Segoe UI" w:hAnsi="Segoe UI"/>
+                <w:b/>
+                <w:color w:val="FFFFFF"/>
+                <w:sz w:val="18"/>
+              </w:rPr>
+              <w:t>MAE ($)</w:t>
+            </w:r>
+          </w:p>
+        </w:tc>
+        <w:tc>
+          <w:tcPr>
+            <w:tcW w:type="dxa" w:w="2016"/>
+            <w:shd w:fill="064A56"/>
+          </w:tcPr>
+          <w:p>
+            <w:pPr>
+              <w:jc w:val="center"/>
+            </w:pPr>
+            <w:r>
+              <w:rPr>
+                <w:rFonts w:ascii="Segoe UI" w:hAnsi="Segoe UI"/>
+                <w:b/>
+                <w:color w:val="FFFFFF"/>
+                <w:sz w:val="18"/>
+              </w:rPr>
+              <w:t>R² Score</w:t>
+            </w:r>
+          </w:p>
+        </w:tc>
+      </w:tr>
+      <w:tr>
+        <w:tc>
+          <w:tcPr>
+            <w:tcW w:type="dxa" w:w="2016"/>
             <w:shd w:fill="FFFFFF"/>
           </w:tcPr>
           <w:p>
@@ -570,7 +882,189 @@
                 <w:color w:val="212529"/>
                 <w:sz w:val="17"/>
               </w:rPr>
+              <w:t>Naive baseline (median rpm x dist)</w:t>
+            </w:r>
+          </w:p>
+        </w:tc>
+        <w:tc>
+          <w:tcPr>
+            <w:tcW w:type="dxa" w:w="2016"/>
+            <w:shd w:fill="FFFFFF"/>
+          </w:tcPr>
+          <w:p>
+            <w:r>
+              <w:rPr>
+                <w:rFonts w:ascii="Segoe UI" w:hAnsi="Segoe UI"/>
+                <w:color w:val="212529"/>
+                <w:sz w:val="17"/>
+              </w:rPr>
+              <w:t>—</w:t>
+            </w:r>
+          </w:p>
+        </w:tc>
+        <w:tc>
+          <w:tcPr>
+            <w:tcW w:type="dxa" w:w="2016"/>
+            <w:shd w:fill="FFFFFF"/>
+          </w:tcPr>
+          <w:p>
+            <w:pPr>
+              <w:jc w:val="right"/>
+            </w:pPr>
+            <w:r>
+              <w:rPr>
+                <w:rFonts w:ascii="Segoe UI" w:hAnsi="Segoe UI"/>
+                <w:color w:val="212529"/>
+                <w:sz w:val="17"/>
+              </w:rPr>
+              <w:t>~$684</w:t>
+            </w:r>
+          </w:p>
+        </w:tc>
+        <w:tc>
+          <w:tcPr>
+            <w:tcW w:type="dxa" w:w="2016"/>
+            <w:shd w:fill="FFFFFF"/>
+          </w:tcPr>
+          <w:p>
+            <w:pPr>
+              <w:jc w:val="right"/>
+            </w:pPr>
+            <w:r>
+              <w:rPr>
+                <w:rFonts w:ascii="Segoe UI" w:hAnsi="Segoe UI"/>
+                <w:color w:val="212529"/>
+                <w:sz w:val="17"/>
+              </w:rPr>
+              <w:t>~$257</w:t>
+            </w:r>
+          </w:p>
+        </w:tc>
+        <w:tc>
+          <w:tcPr>
+            <w:tcW w:type="dxa" w:w="2016"/>
+            <w:shd w:fill="FFFFFF"/>
+          </w:tcPr>
+          <w:p>
+            <w:pPr>
+              <w:jc w:val="right"/>
+            </w:pPr>
+            <w:r>
+              <w:rPr>
+                <w:rFonts w:ascii="Segoe UI" w:hAnsi="Segoe UI"/>
+                <w:color w:val="212529"/>
+                <w:sz w:val="17"/>
+              </w:rPr>
+              <w:t>~0.80</w:t>
+            </w:r>
+          </w:p>
+        </w:tc>
+      </w:tr>
+      <w:tr>
+        <w:tc>
+          <w:tcPr>
+            <w:tcW w:type="dxa" w:w="2016"/>
+            <w:shd w:fill="F9FBFB"/>
+          </w:tcPr>
+          <w:p>
+            <w:r>
+              <w:rPr>
+                <w:rFonts w:ascii="Segoe UI" w:hAnsi="Segoe UI"/>
+                <w:color w:val="212529"/>
+                <w:sz w:val="17"/>
+              </w:rPr>
               <w:t>XGBoost Direct</w:t>
+            </w:r>
+          </w:p>
+        </w:tc>
+        <w:tc>
+          <w:tcPr>
+            <w:tcW w:type="dxa" w:w="2016"/>
+            <w:shd w:fill="F9FBFB"/>
+          </w:tcPr>
+          <w:p>
+            <w:r>
+              <w:rPr>
+                <w:rFonts w:ascii="Segoe UI" w:hAnsi="Segoe UI"/>
+                <w:color w:val="212529"/>
+                <w:sz w:val="17"/>
+              </w:rPr>
+              <w:t>L2 (MSE)</w:t>
+            </w:r>
+          </w:p>
+        </w:tc>
+        <w:tc>
+          <w:tcPr>
+            <w:tcW w:type="dxa" w:w="2016"/>
+            <w:shd w:fill="F9FBFB"/>
+          </w:tcPr>
+          <w:p>
+            <w:pPr>
+              <w:jc w:val="right"/>
+            </w:pPr>
+            <w:r>
+              <w:rPr>
+                <w:rFonts w:ascii="Segoe UI" w:hAnsi="Segoe UI"/>
+                <w:color w:val="212529"/>
+                <w:sz w:val="17"/>
+              </w:rPr>
+              <w:t>$758.01</w:t>
+            </w:r>
+          </w:p>
+        </w:tc>
+        <w:tc>
+          <w:tcPr>
+            <w:tcW w:type="dxa" w:w="2016"/>
+            <w:shd w:fill="F9FBFB"/>
+          </w:tcPr>
+          <w:p>
+            <w:pPr>
+              <w:jc w:val="right"/>
+            </w:pPr>
+            <w:r>
+              <w:rPr>
+                <w:rFonts w:ascii="Segoe UI" w:hAnsi="Segoe UI"/>
+                <w:color w:val="212529"/>
+                <w:sz w:val="17"/>
+              </w:rPr>
+              <w:t>$207.05</w:t>
+            </w:r>
+          </w:p>
+        </w:tc>
+        <w:tc>
+          <w:tcPr>
+            <w:tcW w:type="dxa" w:w="2016"/>
+            <w:shd w:fill="F9FBFB"/>
+          </w:tcPr>
+          <w:p>
+            <w:pPr>
+              <w:jc w:val="right"/>
+            </w:pPr>
+            <w:r>
+              <w:rPr>
+                <w:rFonts w:ascii="Segoe UI" w:hAnsi="Segoe UI"/>
+                <w:color w:val="212529"/>
+                <w:sz w:val="17"/>
+              </w:rPr>
+              <w:t>0.7533</w:t>
+            </w:r>
+          </w:p>
+        </w:tc>
+      </w:tr>
+      <w:tr>
+        <w:tc>
+          <w:tcPr>
+            <w:tcW w:type="dxa" w:w="2016"/>
+            <w:shd w:fill="FFFFFF"/>
+          </w:tcPr>
+          <w:p>
+            <w:r>
+              <w:rPr>
+                <w:rFonts w:ascii="Segoe UI" w:hAnsi="Segoe UI"/>
+                <w:color w:val="212529"/>
+                <w:sz w:val="17"/>
+              </w:rPr>
+              <w:t>XGBoost Rate Per Mile</w:t>
             </w:r>
           </w:p>
         </w:tc>
@@ -605,7 +1099,7 @@
                 <w:color w:val="212529"/>
                 <w:sz w:val="17"/>
               </w:rPr>
-              <w:t>$758.01</w:t>
+              <w:t>$710.44</w:t>
             </w:r>
           </w:p>
         </w:tc>
@@ -624,7 +1118,7 @@
                 <w:color w:val="212529"/>
                 <w:sz w:val="17"/>
               </w:rPr>
-              <w:t>$207.05</w:t>
+              <w:t>$186.24</w:t>
             </w:r>
           </w:p>
         </w:tc>
@@ -643,7 +1137,7 @@
                 <w:color w:val="212529"/>
                 <w:sz w:val="17"/>
               </w:rPr>
-              <w:t>0.7533</w:t>
+              <w:t>0.7833</w:t>
             </w:r>
           </w:p>
         </w:tc>
@@ -661,7 +1155,7 @@
                 <w:color w:val="212529"/>
                 <w:sz w:val="17"/>
               </w:rPr>
-              <w:t>XGBoost Rate Per Mile</w:t>
+              <w:t>LightGBM Direct</w:t>
             </w:r>
           </w:p>
         </w:tc>
@@ -696,7 +1190,7 @@
                 <w:color w:val="212529"/>
                 <w:sz w:val="17"/>
               </w:rPr>
-              <w:t>$710.44</w:t>
+              <w:t>$656.49</w:t>
             </w:r>
           </w:p>
         </w:tc>
@@ -715,7 +1209,7 @@
                 <w:color w:val="212529"/>
                 <w:sz w:val="17"/>
               </w:rPr>
-              <w:t>$186.24</w:t>
+              <w:t>$173.61</w:t>
             </w:r>
           </w:p>
         </w:tc>
@@ -734,7 +1228,7 @@
                 <w:color w:val="212529"/>
                 <w:sz w:val="17"/>
               </w:rPr>
-              <w:t>0.7833</w:t>
+              <w:t>0.8149</w:t>
             </w:r>
           </w:p>
         </w:tc>
@@ -752,7 +1246,7 @@
                 <w:color w:val="212529"/>
                 <w:sz w:val="17"/>
               </w:rPr>
-              <w:t>LightGBM Direct</w:t>
+              <w:t>LightGBM Rate Per Mile</w:t>
             </w:r>
           </w:p>
         </w:tc>
@@ -787,7 +1281,7 @@
                 <w:color w:val="212529"/>
                 <w:sz w:val="17"/>
               </w:rPr>
-              <w:t>$656.49</w:t>
+              <w:t>$649.94</w:t>
             </w:r>
           </w:p>
         </w:tc>
@@ -806,7 +1300,7 @@
                 <w:color w:val="212529"/>
                 <w:sz w:val="17"/>
               </w:rPr>
-              <w:t>$173.61</w:t>
+              <w:t>$163.88</w:t>
             </w:r>
           </w:p>
         </w:tc>
@@ -814,97 +1308,6 @@
           <w:tcPr>
             <w:tcW w:type="dxa" w:w="2016"/>
             <w:shd w:fill="FFFFFF"/>
-          </w:tcPr>
-          <w:p>
-            <w:pPr>
-              <w:jc w:val="right"/>
-            </w:pPr>
-            <w:r>
-              <w:rPr>
-                <w:rFonts w:ascii="Segoe UI" w:hAnsi="Segoe UI"/>
-                <w:color w:val="212529"/>
-                <w:sz w:val="17"/>
-              </w:rPr>
-              <w:t>0.8149</w:t>
-            </w:r>
-          </w:p>
-        </w:tc>
-      </w:tr>
-      <w:tr>
-        <w:tc>
-          <w:tcPr>
-            <w:tcW w:type="dxa" w:w="2016"/>
-            <w:shd w:fill="F9FBFB"/>
-          </w:tcPr>
-          <w:p>
-            <w:r>
-              <w:rPr>
-                <w:rFonts w:ascii="Segoe UI" w:hAnsi="Segoe UI"/>
-                <w:color w:val="212529"/>
-                <w:sz w:val="17"/>
-              </w:rPr>
-              <w:t>LightGBM Rate Per Mile</w:t>
-            </w:r>
-          </w:p>
-        </w:tc>
-        <w:tc>
-          <w:tcPr>
-            <w:tcW w:type="dxa" w:w="2016"/>
-            <w:shd w:fill="F9FBFB"/>
-          </w:tcPr>
-          <w:p>
-            <w:r>
-              <w:rPr>
-                <w:rFonts w:ascii="Segoe UI" w:hAnsi="Segoe UI"/>
-                <w:color w:val="212529"/>
-                <w:sz w:val="17"/>
-              </w:rPr>
-              <w:t>L2 (MSE)</w:t>
-            </w:r>
-          </w:p>
-        </w:tc>
-        <w:tc>
-          <w:tcPr>
-            <w:tcW w:type="dxa" w:w="2016"/>
-            <w:shd w:fill="F9FBFB"/>
-          </w:tcPr>
-          <w:p>
-            <w:pPr>
-              <w:jc w:val="right"/>
-            </w:pPr>
-            <w:r>
-              <w:rPr>
-                <w:rFonts w:ascii="Segoe UI" w:hAnsi="Segoe UI"/>
-                <w:color w:val="212529"/>
-                <w:sz w:val="17"/>
-              </w:rPr>
-              <w:t>$649.94</w:t>
-            </w:r>
-          </w:p>
-        </w:tc>
-        <w:tc>
-          <w:tcPr>
-            <w:tcW w:type="dxa" w:w="2016"/>
-            <w:shd w:fill="F9FBFB"/>
-          </w:tcPr>
-          <w:p>
-            <w:pPr>
-              <w:jc w:val="right"/>
-            </w:pPr>
-            <w:r>
-              <w:rPr>
-                <w:rFonts w:ascii="Segoe UI" w:hAnsi="Segoe UI"/>
-                <w:color w:val="212529"/>
-                <w:sz w:val="17"/>
-              </w:rPr>
-              <w:t>$163.88</w:t>
-            </w:r>
-          </w:p>
-        </w:tc>
-        <w:tc>
-          <w:tcPr>
-            <w:tcW w:type="dxa" w:w="2016"/>
-            <w:shd w:fill="F9FBFB"/>
           </w:tcPr>
           <w:p>
             <w:pPr>
@@ -935,7 +1338,7 @@
                 <w:color w:val="064A56"/>
                 <w:sz w:val="17"/>
               </w:rPr>
-              <w:t>Production Tri-Ensemble (Ours)</w:t>
+              <w:t>Tri-Ensemble (Ours)</w:t>
             </w:r>
           </w:p>
         </w:tc>
@@ -972,7 +1375,7 @@
                 <w:color w:val="064A56"/>
                 <w:sz w:val="17"/>
               </w:rPr>
-              <w:t>$634.67</w:t>
+              <w:t>~$639</w:t>
             </w:r>
           </w:p>
         </w:tc>
@@ -992,7 +1395,7 @@
                 <w:color w:val="064A56"/>
                 <w:sz w:val="17"/>
               </w:rPr>
-              <w:t>$110.94</w:t>
+              <w:t>~$129</w:t>
             </w:r>
           </w:p>
         </w:tc>
@@ -1012,7 +1415,7 @@
                 <w:color w:val="064A56"/>
                 <w:sz w:val="17"/>
               </w:rPr>
-              <w:t>0.8270</w:t>
+              <w:t>~0.824</w:t>
             </w:r>
           </w:p>
         </w:tc>
@@ -1033,7 +1436,7 @@
           <w:color w:val="212529"/>
           <w:sz w:val="20"/>
         </w:rPr>
-        <w:t>Our final production model is a weighted Tri-Ensemble combining: (1) 70% LightGBM L1 Rate-Per-Mile Regressor, (2) 15% LightGBM L2 Rate-Per-Mile Regressor, and (3) 15% LightGBM L1 Direct Posted Rate Regressor. This blends median outlier robustness with expected-value calibrations, yielding an outstanding OOT MAPE of 4.73% and median error of $35.78.</w:t>
+        <w:t>The Tri-Ensemble (70% L1 RPM + 15% L2 RPM + 15% L1 Direct) reduces MAE by ~$128 and Median AE by ~$83 vs the naive baseline on the Sep-Oct holdout. OOT MAPE is approximately 5.4%.</w:t>
       </w:r>
     </w:p>
     <w:p>
@@ -1048,7 +1451,7 @@
           <w:color w:val="064A56"/>
           <w:sz w:val="28"/>
         </w:rPr>
-        <w:t>6. Fixed December 2025 Forecast &amp; Chart Validation</w:t>
+        <w:t>6. Fixed December 2025 Forecast &amp; Chart</w:t>
       </w:r>
     </w:p>
     <w:p>
@@ -1062,7 +1465,7 @@
           <w:color w:val="212529"/>
           <w:sz w:val="20"/>
         </w:rPr>
-        <w:t xml:space="preserve">Scenario Specifications: </w:t>
+        <w:t xml:space="preserve">Scenario: </w:t>
       </w:r>
       <w:r>
         <w:rPr>
@@ -1070,7 +1473,7 @@
           <w:color w:val="212529"/>
           <w:sz w:val="20"/>
         </w:rPr>
-        <w:t>To evaluate model sensitivity to calendar effects under controlled conditions, Spotter provided a fixed corridor scenario: Lexington to Fort Wayne, 360.0 miles, Dry Van equipment, 32,000 lbs payload, evaluated across every day from December 1 to December 31, 2025.</w:t>
+        <w:t>Scenario: Lexington to Fort Wayne, 360 miles, Dry Van, 32,000 lbs, one prediction per day across December 1-31, 2025.</w:t>
       </w:r>
     </w:p>
     <w:p>
@@ -1083,7 +1486,7 @@
           <w:color w:val="212529"/>
           <w:sz w:val="20"/>
         </w:rPr>
-        <w:t>Below is the official validation visualization generated directly by `score.py` (`scorer_results/candidate_december.png`). The model captures true weekly dispatch cycles: rates rise toward mid-week dispatch peaks (~$826.69 on Wednesdays/Thursdays), soften during weekend lulls (~$808.10), and exhibit an upward surge during late-December holiday freight pushes.</w:t>
+        <w:t>The chart below (Figure 1) is generated by `score.py`. The model captures the weekly day-of-week rhythm observed throughout the training data: Mondays average ~$811, Wednesdays ~$825, weekends a few dollars lower. This pattern repeats weekly throughout December. There is no meaningful late-December surge: day &gt;= 25 averages $783-$812, essentially the same as the rest of the month. The absolute rate level (~$795) should be treated with caution; the model has no December training data, so the true market level for this corridor in December 2025 is not reliably estimated.</w:t>
       </w:r>
     </w:p>
     <w:p>
@@ -1153,7 +1556,7 @@
           <w:color w:val="064A56"/>
           <w:sz w:val="28"/>
         </w:rPr>
-        <w:t>7. Verification &amp; Submission Deliverables</w:t>
+        <w:t>7. Limitations</w:t>
       </w:r>
     </w:p>
     <w:p>
@@ -1166,15 +1569,49 @@
           <w:color w:val="212529"/>
           <w:sz w:val="20"/>
         </w:rPr>
-        <w:t>All candidate submission requirements have been rigorously executed, tested, and validated:</w:t>
+        <w:t>• December absolute rate level is uncertain. The model is trained on Jan-Oct data; whether the true Dec 2025 market level is higher or lower than the predicted ~$795-$825 range cannot be verified without actuals.</w:t>
         <w:br/>
-        <w:t>• `validation_predictions.csv`: 12,000 rows exactly matching `load_id,predicted_rate` schema. Zero non-positive or missing values.</w:t>
+        <w:t>• Single temporal split. A single OOT cut-point has higher variance than a rolling-origin CV. The metrics should be treated as indicative.</w:t>
         <w:br/>
-        <w:t>• `december-chart-inputs.csv` &amp; `data/december_chart_inputs.csv`: Completed with predicted rates across all 31 days.</w:t>
+        <w:t>• ~0.78% corrupted labels. Records with rpm outside [0.5, 6.0] inflate RMSE and affect R². A data audit is warranted.</w:t>
         <w:br/>
-        <w:t>• `score.py` Verification: Verified cleanly with 0 errors (`Validated 12,000 final predictions. Validated 31 fixed December predictions`).</w:t>
+        <w:t>• `quote_signal` contribution is limited (corr ~0.05 with rpm); it functions as a noisy auxiliary signal.</w:t>
         <w:br/>
-        <w:t>• Reproducibility: Standalone `train_predict.py` retrains, evaluates, and regenerates all submission files in ~45 seconds.</w:t>
+        <w:t>• Negative weights corrected with abs(weight) assuming sign-flip errors; if some are sentinel values, the imputation may need revisiting.</w:t>
+      </w:r>
+    </w:p>
+    <w:p>
+      <w:pPr>
+        <w:keepNext/>
+        <w:spacing w:before="240" w:after="80"/>
+      </w:pPr>
+      <w:r>
+        <w:rPr>
+          <w:rFonts w:ascii="Segoe UI" w:hAnsi="Segoe UI"/>
+          <w:b/>
+          <w:color w:val="064A56"/>
+          <w:sz w:val="28"/>
+        </w:rPr>
+        <w:t>8. Verification &amp; Submission Deliverables</w:t>
+      </w:r>
+    </w:p>
+    <w:p>
+      <w:pPr>
+        <w:spacing w:before="40" w:after="80" w:line="276" w:lineRule="auto"/>
+      </w:pPr>
+      <w:r>
+        <w:rPr>
+          <w:rFonts w:ascii="Segoe UI" w:hAnsi="Segoe UI"/>
+          <w:color w:val="212529"/>
+          <w:sz w:val="20"/>
+        </w:rPr>
+        <w:t>• `validation_predictions.csv`: 12,000 rows, columns `load_id,predicted_rate`, all values positive.</w:t>
+        <w:br/>
+        <w:t>• `data/december_chart_inputs.csv`: 31 rows with `predicted_rate` filled (original input CSV never overwritten).</w:t>
+        <w:br/>
+        <w:t>• `score.py` verification: 0 errors (`Validated 12,000 final predictions. Validated 31 fixed December predictions`).</w:t>
+        <w:br/>
+        <w:t>• Reproducibility: `python train_predict.py` retrains and regenerates all output files from scratch.</w:t>
       </w:r>
     </w:p>
     <w:sectPr>

</xml_diff>